<commit_message>
Blueprint: clarify DFD (notation + walkthrough) and add Use Case layout
Rewrote the DFD section to explain the four symbols, give an ASCII
context diagram, and a plain-English Level-1 walkthrough (process/store
tables + how to read each arrow). Added a Use Case diagram section with a
2x2 package layout and association rules. Regenerated the .docx.
</commit_message>
<xml_diff>
--- a/docx/LUCIDCHART_BLUEPRINT.docx
+++ b/docx/LUCIDCHART_BLUEPRINT.docx
@@ -31,7 +31,6 @@
       <w:r>
         <w:rPr>
           <w:rFonts w:ascii="Consolas" w:hAnsi="Consolas"/>
-          <w:color w:val="B03060"/>
           <w:sz w:val="20"/>
         </w:rPr>
         <w:t>diagrams/</w:t>
@@ -58,7 +57,6 @@
       <w:r>
         <w:rPr>
           <w:rFonts w:ascii="Consolas" w:hAnsi="Consolas"/>
-          <w:color w:val="B03060"/>
           <w:sz w:val="20"/>
         </w:rPr>
         <w:t>brgy_sec</w:t>
@@ -69,7 +67,6 @@
       <w:r>
         <w:rPr>
           <w:rFonts w:ascii="Consolas" w:hAnsi="Consolas"/>
-          <w:color w:val="B03060"/>
           <w:sz w:val="20"/>
         </w:rPr>
         <w:t>tanod</w:t>
@@ -129,7 +126,6 @@
       <w:r>
         <w:rPr>
           <w:rFonts w:ascii="Consolas" w:hAnsi="Consolas"/>
-          <w:color w:val="B03060"/>
           <w:sz w:val="20"/>
         </w:rPr>
         <w:t>||</w:t>
@@ -140,7 +136,6 @@
       <w:r>
         <w:rPr>
           <w:rFonts w:ascii="Consolas" w:hAnsi="Consolas"/>
-          <w:color w:val="B03060"/>
           <w:sz w:val="20"/>
         </w:rPr>
         <w:t>o{</w:t>
@@ -187,7 +182,6 @@
       <w:r>
         <w:rPr>
           <w:rFonts w:ascii="Consolas" w:hAnsi="Consolas"/>
-          <w:color w:val="B03060"/>
           <w:sz w:val="20"/>
         </w:rPr>
         <w:t>id</w:t>
@@ -198,7 +192,6 @@
       <w:r>
         <w:rPr>
           <w:rFonts w:ascii="Consolas" w:hAnsi="Consolas"/>
-          <w:color w:val="B03060"/>
           <w:sz w:val="20"/>
         </w:rPr>
         <w:t>email</w:t>
@@ -209,7 +202,6 @@
       <w:r>
         <w:rPr>
           <w:rFonts w:ascii="Consolas" w:hAnsi="Consolas"/>
-          <w:color w:val="B03060"/>
           <w:sz w:val="20"/>
         </w:rPr>
         <w:t>encrypted_password</w:t>
@@ -231,7 +223,6 @@
       <w:r>
         <w:rPr>
           <w:rFonts w:ascii="Consolas" w:hAnsi="Consolas"/>
-          <w:color w:val="B03060"/>
           <w:sz w:val="20"/>
         </w:rPr>
         <w:t>id</w:t>
@@ -242,7 +233,6 @@
       <w:r>
         <w:rPr>
           <w:rFonts w:ascii="Consolas" w:hAnsi="Consolas"/>
-          <w:color w:val="B03060"/>
           <w:sz w:val="20"/>
         </w:rPr>
         <w:t>full_name</w:t>
@@ -253,7 +243,6 @@
       <w:r>
         <w:rPr>
           <w:rFonts w:ascii="Consolas" w:hAnsi="Consolas"/>
-          <w:color w:val="B03060"/>
           <w:sz w:val="20"/>
         </w:rPr>
         <w:t>role</w:t>
@@ -264,7 +253,6 @@
       <w:r>
         <w:rPr>
           <w:rFonts w:ascii="Consolas" w:hAnsi="Consolas"/>
-          <w:color w:val="B03060"/>
           <w:sz w:val="20"/>
         </w:rPr>
         <w:t>brgy_sec</w:t>
@@ -275,7 +263,6 @@
       <w:r>
         <w:rPr>
           <w:rFonts w:ascii="Consolas" w:hAnsi="Consolas"/>
-          <w:color w:val="B03060"/>
           <w:sz w:val="20"/>
         </w:rPr>
         <w:t>tanod</w:t>
@@ -300,7 +287,6 @@
       <w:r>
         <w:rPr>
           <w:rFonts w:ascii="Consolas" w:hAnsi="Consolas"/>
-          <w:color w:val="B03060"/>
           <w:sz w:val="20"/>
         </w:rPr>
         <w:t>id</w:t>
@@ -311,7 +297,6 @@
       <w:r>
         <w:rPr>
           <w:rFonts w:ascii="Consolas" w:hAnsi="Consolas"/>
-          <w:color w:val="B03060"/>
           <w:sz w:val="20"/>
         </w:rPr>
         <w:t>household_no</w:t>
@@ -322,7 +307,6 @@
       <w:r>
         <w:rPr>
           <w:rFonts w:ascii="Consolas" w:hAnsi="Consolas"/>
-          <w:color w:val="B03060"/>
           <w:sz w:val="20"/>
         </w:rPr>
         <w:t>purok</w:t>
@@ -333,7 +317,6 @@
       <w:r>
         <w:rPr>
           <w:rFonts w:ascii="Consolas" w:hAnsi="Consolas"/>
-          <w:color w:val="B03060"/>
           <w:sz w:val="20"/>
         </w:rPr>
         <w:t>head_name</w:t>
@@ -344,7 +327,6 @@
       <w:r>
         <w:rPr>
           <w:rFonts w:ascii="Consolas" w:hAnsi="Consolas"/>
-          <w:color w:val="B03060"/>
           <w:sz w:val="20"/>
         </w:rPr>
         <w:t>latitude</w:t>
@@ -355,7 +337,6 @@
       <w:r>
         <w:rPr>
           <w:rFonts w:ascii="Consolas" w:hAnsi="Consolas"/>
-          <w:color w:val="B03060"/>
           <w:sz w:val="20"/>
         </w:rPr>
         <w:t>longitude</w:t>
@@ -377,7 +358,6 @@
       <w:r>
         <w:rPr>
           <w:rFonts w:ascii="Consolas" w:hAnsi="Consolas"/>
-          <w:color w:val="B03060"/>
           <w:sz w:val="20"/>
         </w:rPr>
         <w:t>id</w:t>
@@ -388,7 +368,6 @@
       <w:r>
         <w:rPr>
           <w:rFonts w:ascii="Consolas" w:hAnsi="Consolas"/>
-          <w:color w:val="B03060"/>
           <w:sz w:val="20"/>
         </w:rPr>
         <w:t>resident_no</w:t>
@@ -399,7 +378,6 @@
       <w:r>
         <w:rPr>
           <w:rFonts w:ascii="Consolas" w:hAnsi="Consolas"/>
-          <w:color w:val="B03060"/>
           <w:sz w:val="20"/>
         </w:rPr>
         <w:t>household_id</w:t>
@@ -410,7 +388,6 @@
       <w:r>
         <w:rPr>
           <w:rFonts w:ascii="Consolas" w:hAnsi="Consolas"/>
-          <w:color w:val="B03060"/>
           <w:sz w:val="20"/>
         </w:rPr>
         <w:t>first_name</w:t>
@@ -421,7 +398,6 @@
       <w:r>
         <w:rPr>
           <w:rFonts w:ascii="Consolas" w:hAnsi="Consolas"/>
-          <w:color w:val="B03060"/>
           <w:sz w:val="20"/>
         </w:rPr>
         <w:t>last_name</w:t>
@@ -437,7 +413,6 @@
       <w:r>
         <w:rPr>
           <w:rFonts w:ascii="Consolas" w:hAnsi="Consolas"/>
-          <w:color w:val="B03060"/>
           <w:sz w:val="20"/>
         </w:rPr>
         <w:t>date_of_birth</w:t>
@@ -448,7 +423,6 @@
       <w:r>
         <w:rPr>
           <w:rFonts w:ascii="Consolas" w:hAnsi="Consolas"/>
-          <w:color w:val="B03060"/>
           <w:sz w:val="20"/>
         </w:rPr>
         <w:t>purok</w:t>
@@ -459,7 +433,6 @@
       <w:r>
         <w:rPr>
           <w:rFonts w:ascii="Consolas" w:hAnsi="Consolas"/>
-          <w:color w:val="B03060"/>
           <w:sz w:val="20"/>
         </w:rPr>
         <w:t>sex</w:t>
@@ -470,7 +443,6 @@
       <w:r>
         <w:rPr>
           <w:rFonts w:ascii="Consolas" w:hAnsi="Consolas"/>
-          <w:color w:val="B03060"/>
           <w:sz w:val="20"/>
         </w:rPr>
         <w:t>civil_status</w:t>
@@ -481,7 +453,6 @@
       <w:r>
         <w:rPr>
           <w:rFonts w:ascii="Consolas" w:hAnsi="Consolas"/>
-          <w:color w:val="B03060"/>
           <w:sz w:val="20"/>
         </w:rPr>
         <w:t>is_household_head</w:t>
@@ -492,7 +463,6 @@
       <w:r>
         <w:rPr>
           <w:rFonts w:ascii="Consolas" w:hAnsi="Consolas"/>
-          <w:color w:val="B03060"/>
           <w:sz w:val="20"/>
         </w:rPr>
         <w:t>is_pwd</w:t>
@@ -503,7 +473,6 @@
       <w:r>
         <w:rPr>
           <w:rFonts w:ascii="Consolas" w:hAnsi="Consolas"/>
-          <w:color w:val="B03060"/>
           <w:sz w:val="20"/>
         </w:rPr>
         <w:t>pwd_type</w:t>
@@ -519,7 +488,6 @@
       <w:r>
         <w:rPr>
           <w:rFonts w:ascii="Consolas" w:hAnsi="Consolas"/>
-          <w:color w:val="B03060"/>
           <w:sz w:val="20"/>
         </w:rPr>
         <w:t>is_senior_citizen</w:t>
@@ -530,7 +498,6 @@
       <w:r>
         <w:rPr>
           <w:rFonts w:ascii="Consolas" w:hAnsi="Consolas"/>
-          <w:color w:val="B03060"/>
           <w:sz w:val="20"/>
         </w:rPr>
         <w:t>is_solo_parent</w:t>
@@ -541,7 +508,6 @@
       <w:r>
         <w:rPr>
           <w:rFonts w:ascii="Consolas" w:hAnsi="Consolas"/>
-          <w:color w:val="B03060"/>
           <w:sz w:val="20"/>
         </w:rPr>
         <w:t>is_out_of_school_youth</w:t>
@@ -552,7 +518,6 @@
       <w:r>
         <w:rPr>
           <w:rFonts w:ascii="Consolas" w:hAnsi="Consolas"/>
-          <w:color w:val="B03060"/>
           <w:sz w:val="20"/>
         </w:rPr>
         <w:t>is_voter</w:t>
@@ -563,7 +528,6 @@
       <w:r>
         <w:rPr>
           <w:rFonts w:ascii="Consolas" w:hAnsi="Consolas"/>
-          <w:color w:val="B03060"/>
           <w:sz w:val="20"/>
         </w:rPr>
         <w:t>monthly_income</w:t>
@@ -579,7 +543,6 @@
       <w:r>
         <w:rPr>
           <w:rFonts w:ascii="Consolas" w:hAnsi="Consolas"/>
-          <w:color w:val="B03060"/>
           <w:sz w:val="20"/>
         </w:rPr>
         <w:t>occupation</w:t>
@@ -590,7 +553,6 @@
       <w:r>
         <w:rPr>
           <w:rFonts w:ascii="Consolas" w:hAnsi="Consolas"/>
-          <w:color w:val="B03060"/>
           <w:sz w:val="20"/>
         </w:rPr>
         <w:t>contact_number</w:t>
@@ -612,7 +574,6 @@
       <w:r>
         <w:rPr>
           <w:rFonts w:ascii="Consolas" w:hAnsi="Consolas"/>
-          <w:color w:val="B03060"/>
           <w:sz w:val="20"/>
         </w:rPr>
         <w:t>id</w:t>
@@ -623,7 +584,6 @@
       <w:r>
         <w:rPr>
           <w:rFonts w:ascii="Consolas" w:hAnsi="Consolas"/>
-          <w:color w:val="B03060"/>
           <w:sz w:val="20"/>
         </w:rPr>
         <w:t>name</w:t>
@@ -634,7 +594,6 @@
       <w:r>
         <w:rPr>
           <w:rFonts w:ascii="Consolas" w:hAnsi="Consolas"/>
-          <w:color w:val="B03060"/>
           <w:sz w:val="20"/>
         </w:rPr>
         <w:t>agency</w:t>
@@ -645,7 +604,6 @@
       <w:r>
         <w:rPr>
           <w:rFonts w:ascii="Consolas" w:hAnsi="Consolas"/>
-          <w:color w:val="B03060"/>
           <w:sz w:val="20"/>
         </w:rPr>
         <w:t>description</w:t>
@@ -656,7 +614,6 @@
       <w:r>
         <w:rPr>
           <w:rFonts w:ascii="Consolas" w:hAnsi="Consolas"/>
-          <w:color w:val="B03060"/>
           <w:sz w:val="20"/>
         </w:rPr>
         <w:t>is_active</w:t>
@@ -678,7 +635,6 @@
       <w:r>
         <w:rPr>
           <w:rFonts w:ascii="Consolas" w:hAnsi="Consolas"/>
-          <w:color w:val="B03060"/>
           <w:sz w:val="20"/>
         </w:rPr>
         <w:t>id</w:t>
@@ -689,7 +645,6 @@
       <w:r>
         <w:rPr>
           <w:rFonts w:ascii="Consolas" w:hAnsi="Consolas"/>
-          <w:color w:val="B03060"/>
           <w:sz w:val="20"/>
         </w:rPr>
         <w:t>resident_id</w:t>
@@ -700,7 +655,6 @@
       <w:r>
         <w:rPr>
           <w:rFonts w:ascii="Consolas" w:hAnsi="Consolas"/>
-          <w:color w:val="B03060"/>
           <w:sz w:val="20"/>
         </w:rPr>
         <w:t>program_id</w:t>
@@ -716,7 +670,6 @@
       <w:r>
         <w:rPr>
           <w:rFonts w:ascii="Consolas" w:hAnsi="Consolas"/>
-          <w:color w:val="B03060"/>
           <w:sz w:val="20"/>
         </w:rPr>
         <w:t>status</w:t>
@@ -727,7 +680,6 @@
       <w:r>
         <w:rPr>
           <w:rFonts w:ascii="Consolas" w:hAnsi="Consolas"/>
-          <w:color w:val="B03060"/>
           <w:sz w:val="20"/>
         </w:rPr>
         <w:t>enrolled_at</w:t>
@@ -738,7 +690,6 @@
       <w:r>
         <w:rPr>
           <w:rFonts w:ascii="Consolas" w:hAnsi="Consolas"/>
-          <w:color w:val="B03060"/>
           <w:sz w:val="20"/>
         </w:rPr>
         <w:t>last_release_date</w:t>
@@ -749,7 +700,6 @@
       <w:r>
         <w:rPr>
           <w:rFonts w:ascii="Consolas" w:hAnsi="Consolas"/>
-          <w:color w:val="B03060"/>
           <w:sz w:val="20"/>
         </w:rPr>
         <w:t>total_released</w:t>
@@ -760,7 +710,6 @@
       <w:r>
         <w:rPr>
           <w:rFonts w:ascii="Consolas" w:hAnsi="Consolas"/>
-          <w:color w:val="B03060"/>
           <w:sz w:val="20"/>
         </w:rPr>
         <w:t>notes</w:t>
@@ -782,7 +731,6 @@
       <w:r>
         <w:rPr>
           <w:rFonts w:ascii="Consolas" w:hAnsi="Consolas"/>
-          <w:color w:val="B03060"/>
           <w:sz w:val="20"/>
         </w:rPr>
         <w:t>id</w:t>
@@ -793,7 +741,6 @@
       <w:r>
         <w:rPr>
           <w:rFonts w:ascii="Consolas" w:hAnsi="Consolas"/>
-          <w:color w:val="B03060"/>
           <w:sz w:val="20"/>
         </w:rPr>
         <w:t>resident_id</w:t>
@@ -804,7 +751,6 @@
       <w:r>
         <w:rPr>
           <w:rFonts w:ascii="Consolas" w:hAnsi="Consolas"/>
-          <w:color w:val="B03060"/>
           <w:sz w:val="20"/>
         </w:rPr>
         <w:t>purpose</w:t>
@@ -815,7 +761,6 @@
       <w:r>
         <w:rPr>
           <w:rFonts w:ascii="Consolas" w:hAnsi="Consolas"/>
-          <w:color w:val="B03060"/>
           <w:sz w:val="20"/>
         </w:rPr>
         <w:t>verified_at</w:t>
@@ -837,7 +782,6 @@
       <w:r>
         <w:rPr>
           <w:rFonts w:ascii="Consolas" w:hAnsi="Consolas"/>
-          <w:color w:val="B03060"/>
           <w:sz w:val="20"/>
         </w:rPr>
         <w:t>id</w:t>
@@ -848,7 +792,6 @@
       <w:r>
         <w:rPr>
           <w:rFonts w:ascii="Consolas" w:hAnsi="Consolas"/>
-          <w:color w:val="B03060"/>
           <w:sz w:val="20"/>
         </w:rPr>
         <w:t>resident_id</w:t>
@@ -868,7 +811,6 @@
       <w:r>
         <w:rPr>
           <w:rFonts w:ascii="Consolas" w:hAnsi="Consolas"/>
-          <w:color w:val="B03060"/>
           <w:sz w:val="20"/>
         </w:rPr>
         <w:t>purok</w:t>
@@ -879,7 +821,6 @@
       <w:r>
         <w:rPr>
           <w:rFonts w:ascii="Consolas" w:hAnsi="Consolas"/>
-          <w:color w:val="B03060"/>
           <w:sz w:val="20"/>
         </w:rPr>
         <w:t>priority_need</w:t>
@@ -895,7 +836,6 @@
       <w:r>
         <w:rPr>
           <w:rFonts w:ascii="Consolas" w:hAnsi="Consolas"/>
-          <w:color w:val="B03060"/>
           <w:sz w:val="20"/>
         </w:rPr>
         <w:t>comments</w:t>
@@ -906,7 +846,6 @@
       <w:r>
         <w:rPr>
           <w:rFonts w:ascii="Consolas" w:hAnsi="Consolas"/>
-          <w:color w:val="B03060"/>
           <w:sz w:val="20"/>
         </w:rPr>
         <w:t>photo_url</w:t>
@@ -926,7 +865,6 @@
       <w:r>
         <w:rPr>
           <w:rFonts w:ascii="Consolas" w:hAnsi="Consolas"/>
-          <w:color w:val="B03060"/>
           <w:sz w:val="20"/>
         </w:rPr>
         <w:t>submitted_at</w:t>
@@ -948,7 +886,6 @@
       <w:r>
         <w:rPr>
           <w:rFonts w:ascii="Consolas" w:hAnsi="Consolas"/>
-          <w:color w:val="B03060"/>
           <w:sz w:val="20"/>
         </w:rPr>
         <w:t>id</w:t>
@@ -959,7 +896,6 @@
       <w:r>
         <w:rPr>
           <w:rFonts w:ascii="Consolas" w:hAnsi="Consolas"/>
-          <w:color w:val="B03060"/>
           <w:sz w:val="20"/>
         </w:rPr>
         <w:t>case_no</w:t>
@@ -970,7 +906,6 @@
       <w:r>
         <w:rPr>
           <w:rFonts w:ascii="Consolas" w:hAnsi="Consolas"/>
-          <w:color w:val="B03060"/>
           <w:sz w:val="20"/>
         </w:rPr>
         <w:t>incident_type</w:t>
@@ -981,7 +916,6 @@
       <w:r>
         <w:rPr>
           <w:rFonts w:ascii="Consolas" w:hAnsi="Consolas"/>
-          <w:color w:val="B03060"/>
           <w:sz w:val="20"/>
         </w:rPr>
         <w:t>purok</w:t>
@@ -992,7 +926,6 @@
       <w:r>
         <w:rPr>
           <w:rFonts w:ascii="Consolas" w:hAnsi="Consolas"/>
-          <w:color w:val="B03060"/>
           <w:sz w:val="20"/>
         </w:rPr>
         <w:t>complainant</w:t>
@@ -1003,7 +936,6 @@
       <w:r>
         <w:rPr>
           <w:rFonts w:ascii="Consolas" w:hAnsi="Consolas"/>
-          <w:color w:val="B03060"/>
           <w:sz w:val="20"/>
         </w:rPr>
         <w:t>respondent</w:t>
@@ -1019,7 +951,6 @@
       <w:r>
         <w:rPr>
           <w:rFonts w:ascii="Consolas" w:hAnsi="Consolas"/>
-          <w:color w:val="B03060"/>
           <w:sz w:val="20"/>
         </w:rPr>
         <w:t>description</w:t>
@@ -1030,7 +961,6 @@
       <w:r>
         <w:rPr>
           <w:rFonts w:ascii="Consolas" w:hAnsi="Consolas"/>
-          <w:color w:val="B03060"/>
           <w:sz w:val="20"/>
         </w:rPr>
         <w:t>incident_date</w:t>
@@ -1041,7 +971,6 @@
       <w:r>
         <w:rPr>
           <w:rFonts w:ascii="Consolas" w:hAnsi="Consolas"/>
-          <w:color w:val="B03060"/>
           <w:sz w:val="20"/>
         </w:rPr>
         <w:t>status</w:t>
@@ -1052,7 +981,6 @@
       <w:r>
         <w:rPr>
           <w:rFonts w:ascii="Consolas" w:hAnsi="Consolas"/>
-          <w:color w:val="B03060"/>
           <w:sz w:val="20"/>
         </w:rPr>
         <w:t>resolved_date</w:t>
@@ -1063,7 +991,6 @@
       <w:r>
         <w:rPr>
           <w:rFonts w:ascii="Consolas" w:hAnsi="Consolas"/>
-          <w:color w:val="B03060"/>
           <w:sz w:val="20"/>
         </w:rPr>
         <w:t>officer_id</w:t>
@@ -1079,7 +1006,6 @@
       <w:r>
         <w:rPr>
           <w:rFonts w:ascii="Consolas" w:hAnsi="Consolas"/>
-          <w:color w:val="B03060"/>
           <w:sz w:val="20"/>
         </w:rPr>
         <w:t>latitude</w:t>
@@ -1090,7 +1016,6 @@
       <w:r>
         <w:rPr>
           <w:rFonts w:ascii="Consolas" w:hAnsi="Consolas"/>
-          <w:color w:val="B03060"/>
           <w:sz w:val="20"/>
         </w:rPr>
         <w:t>longitude</w:t>
@@ -1101,7 +1026,6 @@
       <w:r>
         <w:rPr>
           <w:rFonts w:ascii="Consolas" w:hAnsi="Consolas"/>
-          <w:color w:val="B03060"/>
           <w:sz w:val="20"/>
         </w:rPr>
         <w:t>photo_url</w:t>
@@ -1123,7 +1047,6 @@
       <w:r>
         <w:rPr>
           <w:rFonts w:ascii="Consolas" w:hAnsi="Consolas"/>
-          <w:color w:val="B03060"/>
           <w:sz w:val="20"/>
         </w:rPr>
         <w:t>id</w:t>
@@ -1134,7 +1057,6 @@
       <w:r>
         <w:rPr>
           <w:rFonts w:ascii="Consolas" w:hAnsi="Consolas"/>
-          <w:color w:val="B03060"/>
           <w:sz w:val="20"/>
         </w:rPr>
         <w:t>hazard_type</w:t>
@@ -1145,7 +1067,6 @@
       <w:r>
         <w:rPr>
           <w:rFonts w:ascii="Consolas" w:hAnsi="Consolas"/>
-          <w:color w:val="B03060"/>
           <w:sz w:val="20"/>
         </w:rPr>
         <w:t>risk_level</w:t>
@@ -1156,7 +1077,6 @@
       <w:r>
         <w:rPr>
           <w:rFonts w:ascii="Consolas" w:hAnsi="Consolas"/>
-          <w:color w:val="B03060"/>
           <w:sz w:val="20"/>
         </w:rPr>
         <w:t>purok</w:t>
@@ -1167,7 +1087,6 @@
       <w:r>
         <w:rPr>
           <w:rFonts w:ascii="Consolas" w:hAnsi="Consolas"/>
-          <w:color w:val="B03060"/>
           <w:sz w:val="20"/>
         </w:rPr>
         <w:t>description</w:t>
@@ -1183,7 +1102,6 @@
       <w:r>
         <w:rPr>
           <w:rFonts w:ascii="Consolas" w:hAnsi="Consolas"/>
-          <w:color w:val="B03060"/>
           <w:sz w:val="20"/>
         </w:rPr>
         <w:t>radius</w:t>
@@ -1194,7 +1112,6 @@
       <w:r>
         <w:rPr>
           <w:rFonts w:ascii="Consolas" w:hAnsi="Consolas"/>
-          <w:color w:val="B03060"/>
           <w:sz w:val="20"/>
         </w:rPr>
         <w:t>latitude</w:t>
@@ -1205,7 +1122,6 @@
       <w:r>
         <w:rPr>
           <w:rFonts w:ascii="Consolas" w:hAnsi="Consolas"/>
-          <w:color w:val="B03060"/>
           <w:sz w:val="20"/>
         </w:rPr>
         <w:t>longitude</w:t>
@@ -1236,7 +1152,6 @@
       <w:r>
         <w:rPr>
           <w:rFonts w:ascii="Consolas" w:hAnsi="Consolas"/>
-          <w:color w:val="B03060"/>
           <w:sz w:val="20"/>
         </w:rPr>
         <w:t>id</w:t>
@@ -1247,7 +1162,6 @@
       <w:r>
         <w:rPr>
           <w:rFonts w:ascii="Consolas" w:hAnsi="Consolas"/>
-          <w:color w:val="B03060"/>
           <w:sz w:val="20"/>
         </w:rPr>
         <w:t>title</w:t>
@@ -1258,7 +1172,6 @@
       <w:r>
         <w:rPr>
           <w:rFonts w:ascii="Consolas" w:hAnsi="Consolas"/>
-          <w:color w:val="B03060"/>
           <w:sz w:val="20"/>
         </w:rPr>
         <w:t>body</w:t>
@@ -1269,7 +1182,6 @@
       <w:r>
         <w:rPr>
           <w:rFonts w:ascii="Consolas" w:hAnsi="Consolas"/>
-          <w:color w:val="B03060"/>
           <w:sz w:val="20"/>
         </w:rPr>
         <w:t>category</w:t>
@@ -1280,7 +1192,6 @@
       <w:r>
         <w:rPr>
           <w:rFonts w:ascii="Consolas" w:hAnsi="Consolas"/>
-          <w:color w:val="B03060"/>
           <w:sz w:val="20"/>
         </w:rPr>
         <w:t>image_url</w:t>
@@ -1291,7 +1202,6 @@
       <w:r>
         <w:rPr>
           <w:rFonts w:ascii="Consolas" w:hAnsi="Consolas"/>
-          <w:color w:val="B03060"/>
           <w:sz w:val="20"/>
         </w:rPr>
         <w:t>is_active</w:t>
@@ -1307,7 +1217,6 @@
       <w:r>
         <w:rPr>
           <w:rFonts w:ascii="Consolas" w:hAnsi="Consolas"/>
-          <w:color w:val="B03060"/>
           <w:sz w:val="20"/>
         </w:rPr>
         <w:t>posted_by</w:t>
@@ -1332,7 +1241,6 @@
       <w:r>
         <w:rPr>
           <w:rFonts w:ascii="Consolas" w:hAnsi="Consolas"/>
-          <w:color w:val="B03060"/>
           <w:sz w:val="20"/>
         </w:rPr>
         <w:t>id</w:t>
@@ -1343,7 +1251,6 @@
       <w:r>
         <w:rPr>
           <w:rFonts w:ascii="Consolas" w:hAnsi="Consolas"/>
-          <w:color w:val="B03060"/>
           <w:sz w:val="20"/>
         </w:rPr>
         <w:t>year</w:t>
@@ -1354,7 +1261,6 @@
       <w:r>
         <w:rPr>
           <w:rFonts w:ascii="Consolas" w:hAnsi="Consolas"/>
-          <w:color w:val="B03060"/>
           <w:sz w:val="20"/>
         </w:rPr>
         <w:t>total_population</w:t>
@@ -1385,7 +1291,6 @@
       <w:r>
         <w:rPr>
           <w:rFonts w:ascii="Consolas" w:hAnsi="Consolas"/>
-          <w:color w:val="B03060"/>
           <w:sz w:val="20"/>
         </w:rPr>
         <w:t>id</w:t>
@@ -1396,7 +1301,6 @@
       <w:r>
         <w:rPr>
           <w:rFonts w:ascii="Consolas" w:hAnsi="Consolas"/>
-          <w:color w:val="B03060"/>
           <w:sz w:val="20"/>
         </w:rPr>
         <w:t>table_name</w:t>
@@ -1407,7 +1311,6 @@
       <w:r>
         <w:rPr>
           <w:rFonts w:ascii="Consolas" w:hAnsi="Consolas"/>
-          <w:color w:val="B03060"/>
           <w:sz w:val="20"/>
         </w:rPr>
         <w:t>action</w:t>
@@ -1418,7 +1321,6 @@
       <w:r>
         <w:rPr>
           <w:rFonts w:ascii="Consolas" w:hAnsi="Consolas"/>
-          <w:color w:val="B03060"/>
           <w:sz w:val="20"/>
         </w:rPr>
         <w:t>record_id</w:t>
@@ -1429,7 +1331,6 @@
       <w:r>
         <w:rPr>
           <w:rFonts w:ascii="Consolas" w:hAnsi="Consolas"/>
-          <w:color w:val="B03060"/>
           <w:sz w:val="20"/>
         </w:rPr>
         <w:t>old_data</w:t>
@@ -1445,7 +1346,6 @@
       <w:r>
         <w:rPr>
           <w:rFonts w:ascii="Consolas" w:hAnsi="Consolas"/>
-          <w:color w:val="B03060"/>
           <w:sz w:val="20"/>
         </w:rPr>
         <w:t>new_data</w:t>
@@ -1456,7 +1356,6 @@
       <w:r>
         <w:rPr>
           <w:rFonts w:ascii="Consolas" w:hAnsi="Consolas"/>
-          <w:color w:val="B03060"/>
           <w:sz w:val="20"/>
         </w:rPr>
         <w:t>changed_by</w:t>
@@ -1467,7 +1366,6 @@
       <w:r>
         <w:rPr>
           <w:rFonts w:ascii="Consolas" w:hAnsi="Consolas"/>
-          <w:color w:val="B03060"/>
           <w:sz w:val="20"/>
         </w:rPr>
         <w:t>changed_at</w:t>
@@ -1678,7 +1576,6 @@
       <w:r>
         <w:rPr>
           <w:rFonts w:ascii="Consolas" w:hAnsi="Consolas"/>
-          <w:color w:val="B03060"/>
           <w:sz w:val="20"/>
         </w:rPr>
         <w:t>residents</w:t>
@@ -1797,7 +1694,6 @@
     <w:p>
       <w:pPr>
         <w:pStyle w:val="ListBullet"/>
-        <w:ind w:left="720"/>
       </w:pPr>
       <w:r>
         <w:rPr>
@@ -1818,7 +1714,6 @@
     <w:p>
       <w:pPr>
         <w:pStyle w:val="ListBullet"/>
-        <w:ind w:left="720"/>
       </w:pPr>
       <w:r>
         <w:rPr>
@@ -1844,7 +1739,6 @@
     <w:p>
       <w:pPr>
         <w:pStyle w:val="ListBullet"/>
-        <w:ind w:left="720"/>
       </w:pPr>
       <w:r>
         <w:rPr>
@@ -1865,7 +1759,6 @@
     <w:p>
       <w:pPr>
         <w:pStyle w:val="ListBullet"/>
-        <w:ind w:left="720"/>
       </w:pPr>
       <w:r>
         <w:rPr>
@@ -1891,7 +1784,6 @@
     <w:p>
       <w:pPr>
         <w:pStyle w:val="ListBullet"/>
-        <w:ind w:left="720"/>
       </w:pPr>
       <w:r>
         <w:rPr>
@@ -1906,7 +1798,6 @@
     <w:p>
       <w:pPr>
         <w:pStyle w:val="ListBullet"/>
-        <w:ind w:left="720"/>
       </w:pPr>
       <w:r>
         <w:rPr>
@@ -1938,7 +1829,6 @@
     <w:p>
       <w:pPr>
         <w:pStyle w:val="ListBullet"/>
-        <w:ind w:left="720"/>
       </w:pPr>
       <w:r>
         <w:t xml:space="preserve">[Resident Profiling] → </w:t>
@@ -1953,7 +1843,6 @@
     <w:p>
       <w:pPr>
         <w:pStyle w:val="ListBullet"/>
-        <w:ind w:left="720"/>
       </w:pPr>
       <w:r>
         <w:t xml:space="preserve">[QR Verification] → </w:t>
@@ -1968,7 +1857,6 @@
     <w:p>
       <w:pPr>
         <w:pStyle w:val="ListBullet"/>
-        <w:ind w:left="720"/>
       </w:pPr>
       <w:r>
         <w:t xml:space="preserve">[GIS Household Map] → </w:t>
@@ -1983,7 +1871,6 @@
     <w:p>
       <w:pPr>
         <w:pStyle w:val="ListBullet"/>
-        <w:ind w:left="720"/>
       </w:pPr>
       <w:r>
         <w:t xml:space="preserve">[Disaster Vulnerability] → </w:t>
@@ -1998,7 +1885,6 @@
     <w:p>
       <w:pPr>
         <w:pStyle w:val="ListBullet"/>
-        <w:ind w:left="720"/>
       </w:pPr>
       <w:r>
         <w:t xml:space="preserve">[Crime &amp; Incident] → </w:t>
@@ -2013,7 +1899,6 @@
     <w:p>
       <w:pPr>
         <w:pStyle w:val="ListBullet"/>
-        <w:ind w:left="720"/>
       </w:pPr>
       <w:r>
         <w:t xml:space="preserve">[Crime Hotspot Map] → </w:t>
@@ -2028,7 +1913,6 @@
     <w:p>
       <w:pPr>
         <w:pStyle w:val="ListBullet"/>
-        <w:ind w:left="720"/>
       </w:pPr>
       <w:r>
         <w:t xml:space="preserve">[Beneficiary Tracking] → </w:t>
@@ -2043,7 +1927,6 @@
     <w:p>
       <w:pPr>
         <w:pStyle w:val="ListBullet"/>
-        <w:ind w:left="720"/>
       </w:pPr>
       <w:r>
         <w:t xml:space="preserve">[Analytics Dashboards] → </w:t>
@@ -2058,7 +1941,6 @@
     <w:p>
       <w:pPr>
         <w:pStyle w:val="ListBullet"/>
-        <w:ind w:left="720"/>
       </w:pPr>
       <w:r>
         <w:t xml:space="preserve">[Predictive Growth] → </w:t>
@@ -2073,7 +1955,6 @@
     <w:p>
       <w:pPr>
         <w:pStyle w:val="ListBullet"/>
-        <w:ind w:left="720"/>
       </w:pPr>
       <w:r>
         <w:t xml:space="preserve">[Announcements &amp; Needs] → </w:t>
@@ -2088,7 +1969,6 @@
     <w:p>
       <w:pPr>
         <w:pStyle w:val="ListBullet"/>
-        <w:ind w:left="720"/>
       </w:pPr>
       <w:r>
         <w:t xml:space="preserve">[DILG Reports] → </w:t>
@@ -2372,74 +2252,50 @@
       </w:r>
     </w:p>
     <w:p>
-      <w:pPr>
-        <w:pStyle w:val="Heading3"/>
-      </w:pPr>
-      <w:r>
-        <w:t>Context Diagram (Level 0)</w:t>
-      </w:r>
-    </w:p>
-    <w:p>
       <w:r>
         <w:rPr>
           <w:b/>
         </w:rPr>
-        <w:t>External entities</w:t>
-      </w:r>
-      <w:r>
-        <w:t xml:space="preserve"> (rectangles): </w:t>
+        <w:t>First, what a DFD is (and how it differs from the flowchart):</w:t>
+      </w:r>
+      <w:r>
+        <w:t xml:space="preserve"> a DFD shows how </w:t>
       </w:r>
       <w:r>
         <w:rPr>
           <w:b/>
         </w:rPr>
-        <w:t>Barangay Staff</w:t>
-      </w:r>
-      <w:r>
-        <w:t xml:space="preserve"> (Secretary / Tanod), </w:t>
-      </w:r>
+        <w:t>data moves</w:t>
+      </w:r>
+    </w:p>
+    <w:p>
+      <w:r>
+        <w:t xml:space="preserve">around the system — </w:t>
+      </w:r>
+      <w:r>
+        <w:rPr>
+          <w:i/>
+        </w:rPr>
+        <w:t>who sends data, what the system does to it, and where it is stored</w:t>
+      </w:r>
+      <w:r>
+        <w:t>. It does</w:t>
+      </w:r>
+    </w:p>
+    <w:p>
       <w:r>
         <w:rPr>
           <w:b/>
         </w:rPr>
-        <w:t>Resident / Public</w:t>
-      </w:r>
-      <w:r>
-        <w:t>,</w:t>
+        <w:t>not</w:t>
+      </w:r>
+      <w:r>
+        <w:t xml:space="preserve"> show step-by-step order or decisions (that's the System Flowchart). A DFD uses only **four</w:t>
       </w:r>
     </w:p>
     <w:p>
       <w:r>
-        <w:rPr>
-          <w:b/>
-        </w:rPr>
-        <w:t>DILG / Government</w:t>
-      </w:r>
-      <w:r>
-        <w:t xml:space="preserve">. </w:t>
-      </w:r>
-      <w:r>
-        <w:rPr>
-          <w:b/>
-        </w:rPr>
-        <w:t>One process</w:t>
-      </w:r>
-      <w:r>
-        <w:t xml:space="preserve"> (circle/rounded): </w:t>
-      </w:r>
-      <w:r>
-        <w:rPr>
-          <w:b/>
-        </w:rPr>
-        <w:t>PROTECT System</w:t>
-      </w:r>
-      <w:r>
-        <w:t>.</w:t>
-      </w:r>
-    </w:p>
-    <w:p>
-      <w:r>
-        <w:t>Data flows (arrows):</w:t>
+        <w:t>symbols**:</w:t>
       </w:r>
     </w:p>
     <w:p>
@@ -2447,13 +2303,36 @@
         <w:pStyle w:val="ListBullet"/>
       </w:pPr>
       <w:r>
-        <w:t xml:space="preserve">Barangay Staff → System: </w:t>
+        <w:rPr>
+          <w:b/>
+        </w:rPr>
+        <w:t>External entity</w:t>
+      </w:r>
+      <w:r>
+        <w:t xml:space="preserve"> — a </w:t>
       </w:r>
       <w:r>
         <w:rPr>
           <w:i/>
         </w:rPr>
-        <w:t>resident, household, incident, beneficiary, announcement data</w:t>
+        <w:t>rectangle</w:t>
+      </w:r>
+      <w:r>
+        <w:t xml:space="preserve">. A person or office </w:t>
+      </w:r>
+      <w:r>
+        <w:rPr>
+          <w:b/>
+        </w:rPr>
+        <w:t>outside</w:t>
+      </w:r>
+      <w:r>
+        <w:t xml:space="preserve"> the system that sends or</w:t>
+      </w:r>
+    </w:p>
+    <w:p>
+      <w:r>
+        <w:t xml:space="preserve">  receives data (Barangay Staff, Resident/Public, DILG).</w:t>
       </w:r>
     </w:p>
     <w:p>
@@ -2461,13 +2340,36 @@
         <w:pStyle w:val="ListBullet"/>
       </w:pPr>
       <w:r>
-        <w:t xml:space="preserve">System → Barangay Staff: </w:t>
+        <w:rPr>
+          <w:b/>
+        </w:rPr>
+        <w:t>Process</w:t>
+      </w:r>
+      <w:r>
+        <w:t xml:space="preserve"> — a </w:t>
       </w:r>
       <w:r>
         <w:rPr>
           <w:i/>
         </w:rPr>
-        <w:t>dashboards, maps, certificates, reports</w:t>
+        <w:t>circle</w:t>
+      </w:r>
+      <w:r>
+        <w:t xml:space="preserve"> (or rounded box). Something the system </w:t>
+      </w:r>
+      <w:r>
+        <w:rPr>
+          <w:b/>
+        </w:rPr>
+        <w:t>does</w:t>
+      </w:r>
+      <w:r>
+        <w:t xml:space="preserve"> to data</w:t>
+      </w:r>
+    </w:p>
+    <w:p>
+      <w:r>
+        <w:t xml:space="preserve">  (e.g., "Manage Residents"). In Level 1 each process gets a number (1.0, 2.0, …).</w:t>
       </w:r>
     </w:p>
     <w:p>
@@ -2475,13 +2377,36 @@
         <w:pStyle w:val="ListBullet"/>
       </w:pPr>
       <w:r>
-        <w:t xml:space="preserve">System → DILG / Government: </w:t>
+        <w:rPr>
+          <w:b/>
+        </w:rPr>
+        <w:t>Data store</w:t>
+      </w:r>
+      <w:r>
+        <w:t xml:space="preserve"> — an </w:t>
       </w:r>
       <w:r>
         <w:rPr>
           <w:i/>
         </w:rPr>
-        <w:t>compliance reports (submitted by the barangay)</w:t>
+        <w:t>open-ended rectangle</w:t>
+      </w:r>
+      <w:r>
+        <w:t xml:space="preserve"> (two parallel lines). Where data is </w:t>
+      </w:r>
+      <w:r>
+        <w:rPr>
+          <w:b/>
+        </w:rPr>
+        <w:t>kept</w:t>
+      </w:r>
+      <w:r>
+        <w:t xml:space="preserve"> — i.e., a</w:t>
+      </w:r>
+    </w:p>
+    <w:p>
+      <w:r>
+        <w:t xml:space="preserve">  database table.</w:t>
       </w:r>
     </w:p>
     <w:p>
@@ -2489,13 +2414,893 @@
         <w:pStyle w:val="ListBullet"/>
       </w:pPr>
       <w:r>
-        <w:t xml:space="preserve">Resident / Public → System: </w:t>
+        <w:rPr>
+          <w:b/>
+        </w:rPr>
+        <w:t>Data flow</w:t>
+      </w:r>
+      <w:r>
+        <w:t xml:space="preserve"> — a </w:t>
       </w:r>
       <w:r>
         <w:rPr>
           <w:i/>
         </w:rPr>
-        <w:t>community needs survey</w:t>
+        <w:t>labeled arrow</w:t>
+      </w:r>
+      <w:r>
+        <w:t xml:space="preserve">. Shows </w:t>
+      </w:r>
+      <w:r>
+        <w:rPr>
+          <w:b/>
+        </w:rPr>
+        <w:t>what</w:t>
+      </w:r>
+      <w:r>
+        <w:t xml:space="preserve"> data moves and </w:t>
+      </w:r>
+      <w:r>
+        <w:rPr>
+          <w:b/>
+        </w:rPr>
+        <w:t>which direction</w:t>
+      </w:r>
+      <w:r>
+        <w:t xml:space="preserve"> it goes.</w:t>
+      </w:r>
+    </w:p>
+    <w:p>
+      <w:r>
+        <w:rPr>
+          <w:color w:val="CCCCCC"/>
+        </w:rPr>
+        <w:t>__________________________________________________</w:t>
+      </w:r>
+    </w:p>
+    <w:p>
+      <w:pPr>
+        <w:pStyle w:val="Heading3"/>
+      </w:pPr>
+      <w:r>
+        <w:t>Context Diagram (Level 0) — the whole system as ONE bubble</w:t>
+      </w:r>
+    </w:p>
+    <w:p>
+      <w:r>
+        <w:t xml:space="preserve">Draw one big circle, </w:t>
+      </w:r>
+      <w:r>
+        <w:rPr>
+          <w:b/>
+        </w:rPr>
+        <w:t>PROTECT System</w:t>
+      </w:r>
+      <w:r>
+        <w:t>, in the middle. Put the three external entities around it</w:t>
+      </w:r>
+    </w:p>
+    <w:p>
+      <w:r>
+        <w:t>and connect them with labeled arrows. That's the entire diagram — it just shows what goes in and out.</w:t>
+      </w:r>
+    </w:p>
+    <w:p>
+      <w:r>
+        <w:rPr>
+          <w:rFonts w:ascii="Consolas" w:hAnsi="Consolas"/>
+          <w:sz w:val="17"/>
+        </w:rPr>
+        <w:t xml:space="preserve">                          (resident, household, incident,</w:t>
+        <w:br/>
+        <w:t xml:space="preserve">                           beneficiary, announcement data)</w:t>
+        <w:br/>
+        <w:t xml:space="preserve">   ┌──────────────────┐  ───────────────────────────────▶   ╭──────────────╮</w:t>
+        <w:br/>
+        <w:t xml:space="preserve">   │  Barangay Staff  │                                      │              │   (compliance</w:t>
+        <w:br/>
+        <w:t xml:space="preserve">   │ (Secretary/Tanod)│  ◀───────────────────────────────   │   PROTECT    │    reports)     ┌────────────────┐</w:t>
+        <w:br/>
+        <w:t xml:space="preserve">   └──────────────────┘   (dashboards, maps, certificates,   │    System    │ ───────────────▶│ DILG/Government │</w:t>
+        <w:br/>
+        <w:t xml:space="preserve">                            reports)                         │              │                 └────────────────┘</w:t>
+        <w:br/>
+        <w:t xml:space="preserve">   ┌──────────────────┐  ───(community needs survey)──────▶  │              │</w:t>
+        <w:br/>
+        <w:t xml:space="preserve">   │ Resident/Public  │                                      │              │</w:t>
+        <w:br/>
+        <w:t xml:space="preserve">   └──────────────────┘  ◀──(public announcements)────────   ╰──────────────╯</w:t>
+      </w:r>
+    </w:p>
+    <w:p>
+      <w:r>
+        <w:rPr>
+          <w:b/>
+        </w:rPr>
+        <w:t>In plain words:</w:t>
+      </w:r>
+      <w:r>
+        <w:t xml:space="preserve"> Staff type data IN and get dashboards/maps/reports OUT. Residents submit their</w:t>
+      </w:r>
+    </w:p>
+    <w:p>
+      <w:r>
+        <w:t>needs and read announcements. The barangay sends compliance reports to DILG. One picture, the whole</w:t>
+      </w:r>
+    </w:p>
+    <w:p>
+      <w:r>
+        <w:t>system.</w:t>
+      </w:r>
+    </w:p>
+    <w:p>
+      <w:r>
+        <w:rPr>
+          <w:color w:val="CCCCCC"/>
+        </w:rPr>
+        <w:t>__________________________________________________</w:t>
+      </w:r>
+    </w:p>
+    <w:p>
+      <w:pPr>
+        <w:pStyle w:val="Heading3"/>
+      </w:pPr>
+      <w:r>
+        <w:t>Level 1 Diagram — the ONE bubble "exploded" into 7 processes</w:t>
+      </w:r>
+    </w:p>
+    <w:p>
+      <w:r>
+        <w:t>Level 1 takes that single PROTECT bubble and opens it up to show the **7 things the system actually</w:t>
+      </w:r>
+    </w:p>
+    <w:p>
+      <w:r>
+        <w:t>does</w:t>
+      </w:r>
+      <w:r>
+        <w:rPr>
+          <w:b/>
+        </w:rPr>
+        <w:t xml:space="preserve">, plus the </w:t>
+      </w:r>
+      <w:r>
+        <w:t>database tables** each one reads from or writes to. The same three external</w:t>
+      </w:r>
+    </w:p>
+    <w:p>
+      <w:r>
+        <w:t>entities stay on the edges.</w:t>
+      </w:r>
+    </w:p>
+    <w:p>
+      <w:r>
+        <w:rPr>
+          <w:b/>
+        </w:rPr>
+        <w:t>The 7 processes (draw each as a numbered circle):</w:t>
+      </w:r>
+    </w:p>
+    <w:tbl>
+      <w:tblPr>
+        <w:tblStyle w:val="LightGrid-Accent1"/>
+        <w:tblW w:type="auto" w:w="0"/>
+        <w:tblLook w:firstColumn="1" w:firstRow="1" w:lastColumn="0" w:lastRow="0" w:noHBand="0" w:noVBand="1" w:val="04A0"/>
+      </w:tblPr>
+      <w:tblGrid>
+        <w:gridCol w:w="2160"/>
+        <w:gridCol w:w="2160"/>
+        <w:gridCol w:w="2160"/>
+        <w:gridCol w:w="2160"/>
+      </w:tblGrid>
+      <w:tr>
+        <w:tc>
+          <w:tcPr>
+            <w:tcW w:type="dxa" w:w="2160"/>
+          </w:tcPr>
+          <w:p>
+            <w:r>
+              <w:rPr>
+                <w:b/>
+              </w:rPr>
+            </w:r>
+            <w:r>
+              <w:rPr>
+                <w:b/>
+              </w:rPr>
+              <w:t>#</w:t>
+            </w:r>
+          </w:p>
+        </w:tc>
+        <w:tc>
+          <w:tcPr>
+            <w:tcW w:type="dxa" w:w="2160"/>
+          </w:tcPr>
+          <w:p>
+            <w:r>
+              <w:rPr>
+                <w:b/>
+              </w:rPr>
+            </w:r>
+            <w:r>
+              <w:rPr>
+                <w:b/>
+              </w:rPr>
+              <w:t>Process</w:t>
+            </w:r>
+          </w:p>
+        </w:tc>
+        <w:tc>
+          <w:tcPr>
+            <w:tcW w:type="dxa" w:w="2160"/>
+          </w:tcPr>
+          <w:p>
+            <w:r>
+              <w:rPr>
+                <w:b/>
+              </w:rPr>
+            </w:r>
+            <w:r>
+              <w:rPr>
+                <w:b/>
+              </w:rPr>
+              <w:t>Triggered by</w:t>
+            </w:r>
+          </w:p>
+        </w:tc>
+        <w:tc>
+          <w:tcPr>
+            <w:tcW w:type="dxa" w:w="2160"/>
+          </w:tcPr>
+          <w:p>
+            <w:r>
+              <w:rPr>
+                <w:b/>
+              </w:rPr>
+            </w:r>
+            <w:r>
+              <w:rPr>
+                <w:b/>
+              </w:rPr>
+              <w:t>Reads / writes these data stores</w:t>
+            </w:r>
+          </w:p>
+        </w:tc>
+      </w:tr>
+      <w:tr>
+        <w:tc>
+          <w:tcPr>
+            <w:tcW w:type="dxa" w:w="2160"/>
+          </w:tcPr>
+          <w:p>
+            <w:r/>
+            <w:r>
+              <w:t>1.0</w:t>
+            </w:r>
+          </w:p>
+        </w:tc>
+        <w:tc>
+          <w:tcPr>
+            <w:tcW w:type="dxa" w:w="2160"/>
+          </w:tcPr>
+          <w:p>
+            <w:r/>
+            <w:r>
+              <w:t>Authenticate &amp; Authorize</w:t>
+            </w:r>
+          </w:p>
+        </w:tc>
+        <w:tc>
+          <w:tcPr>
+            <w:tcW w:type="dxa" w:w="2160"/>
+          </w:tcPr>
+          <w:p>
+            <w:r/>
+            <w:r>
+              <w:t>Staff</w:t>
+            </w:r>
+          </w:p>
+        </w:tc>
+        <w:tc>
+          <w:tcPr>
+            <w:tcW w:type="dxa" w:w="2160"/>
+          </w:tcPr>
+          <w:p>
+            <w:r/>
+            <w:r>
+              <w:t xml:space="preserve">writes/reads </w:t>
+            </w:r>
+            <w:r>
+              <w:rPr>
+                <w:b/>
+              </w:rPr>
+              <w:t>D1 profiles</w:t>
+            </w:r>
+          </w:p>
+        </w:tc>
+      </w:tr>
+      <w:tr>
+        <w:tc>
+          <w:tcPr>
+            <w:tcW w:type="dxa" w:w="2160"/>
+          </w:tcPr>
+          <w:p>
+            <w:r/>
+            <w:r>
+              <w:t>2.0</w:t>
+            </w:r>
+          </w:p>
+        </w:tc>
+        <w:tc>
+          <w:tcPr>
+            <w:tcW w:type="dxa" w:w="2160"/>
+          </w:tcPr>
+          <w:p>
+            <w:r/>
+            <w:r>
+              <w:t>Manage Residents &amp; Households / GIS</w:t>
+            </w:r>
+          </w:p>
+        </w:tc>
+        <w:tc>
+          <w:tcPr>
+            <w:tcW w:type="dxa" w:w="2160"/>
+          </w:tcPr>
+          <w:p>
+            <w:r/>
+            <w:r>
+              <w:t>Staff</w:t>
+            </w:r>
+          </w:p>
+        </w:tc>
+        <w:tc>
+          <w:tcPr>
+            <w:tcW w:type="dxa" w:w="2160"/>
+          </w:tcPr>
+          <w:p>
+            <w:r/>
+            <w:r>
+              <w:t xml:space="preserve">reads + writes </w:t>
+            </w:r>
+            <w:r>
+              <w:rPr>
+                <w:b/>
+              </w:rPr>
+              <w:t>D2 residents · households</w:t>
+            </w:r>
+          </w:p>
+        </w:tc>
+      </w:tr>
+      <w:tr>
+        <w:tc>
+          <w:tcPr>
+            <w:tcW w:type="dxa" w:w="2160"/>
+          </w:tcPr>
+          <w:p>
+            <w:r/>
+            <w:r>
+              <w:t>3.0</w:t>
+            </w:r>
+          </w:p>
+        </w:tc>
+        <w:tc>
+          <w:tcPr>
+            <w:tcW w:type="dxa" w:w="2160"/>
+          </w:tcPr>
+          <w:p>
+            <w:r/>
+            <w:r>
+              <w:t>Log Incidents &amp; Map Crime</w:t>
+            </w:r>
+          </w:p>
+        </w:tc>
+        <w:tc>
+          <w:tcPr>
+            <w:tcW w:type="dxa" w:w="2160"/>
+          </w:tcPr>
+          <w:p>
+            <w:r/>
+            <w:r>
+              <w:t>Staff</w:t>
+            </w:r>
+          </w:p>
+        </w:tc>
+        <w:tc>
+          <w:tcPr>
+            <w:tcW w:type="dxa" w:w="2160"/>
+          </w:tcPr>
+          <w:p>
+            <w:r/>
+            <w:r>
+              <w:t xml:space="preserve">reads + writes </w:t>
+            </w:r>
+            <w:r>
+              <w:rPr>
+                <w:b/>
+              </w:rPr>
+              <w:t>D3 incidents · disaster_risk_zones</w:t>
+            </w:r>
+          </w:p>
+        </w:tc>
+      </w:tr>
+      <w:tr>
+        <w:tc>
+          <w:tcPr>
+            <w:tcW w:type="dxa" w:w="2160"/>
+          </w:tcPr>
+          <w:p>
+            <w:r/>
+            <w:r>
+              <w:t>4.0</w:t>
+            </w:r>
+          </w:p>
+        </w:tc>
+        <w:tc>
+          <w:tcPr>
+            <w:tcW w:type="dxa" w:w="2160"/>
+          </w:tcPr>
+          <w:p>
+            <w:r/>
+            <w:r>
+              <w:t>Manage Beneficiaries &amp; Assistance</w:t>
+            </w:r>
+          </w:p>
+        </w:tc>
+        <w:tc>
+          <w:tcPr>
+            <w:tcW w:type="dxa" w:w="2160"/>
+          </w:tcPr>
+          <w:p>
+            <w:r/>
+            <w:r>
+              <w:t>Staff</w:t>
+            </w:r>
+          </w:p>
+        </w:tc>
+        <w:tc>
+          <w:tcPr>
+            <w:tcW w:type="dxa" w:w="2160"/>
+          </w:tcPr>
+          <w:p>
+            <w:r/>
+            <w:r>
+              <w:t xml:space="preserve">reads + writes </w:t>
+            </w:r>
+            <w:r>
+              <w:rPr>
+                <w:b/>
+              </w:rPr>
+              <w:t>D4 beneficiaries · assistance_programs</w:t>
+            </w:r>
+          </w:p>
+        </w:tc>
+      </w:tr>
+      <w:tr>
+        <w:tc>
+          <w:tcPr>
+            <w:tcW w:type="dxa" w:w="2160"/>
+          </w:tcPr>
+          <w:p>
+            <w:r/>
+            <w:r>
+              <w:t>5.0</w:t>
+            </w:r>
+          </w:p>
+        </w:tc>
+        <w:tc>
+          <w:tcPr>
+            <w:tcW w:type="dxa" w:w="2160"/>
+          </w:tcPr>
+          <w:p>
+            <w:r/>
+            <w:r>
+              <w:t>QR Verification &amp; Documents</w:t>
+            </w:r>
+          </w:p>
+        </w:tc>
+        <w:tc>
+          <w:tcPr>
+            <w:tcW w:type="dxa" w:w="2160"/>
+          </w:tcPr>
+          <w:p>
+            <w:r/>
+            <w:r>
+              <w:t>Staff</w:t>
+            </w:r>
+          </w:p>
+        </w:tc>
+        <w:tc>
+          <w:tcPr>
+            <w:tcW w:type="dxa" w:w="2160"/>
+          </w:tcPr>
+          <w:p>
+            <w:r/>
+            <w:r>
+              <w:t xml:space="preserve">reads </w:t>
+            </w:r>
+            <w:r>
+              <w:rPr>
+                <w:b/>
+              </w:rPr>
+              <w:t>D2</w:t>
+            </w:r>
+            <w:r>
+              <w:t xml:space="preserve">, writes </w:t>
+            </w:r>
+            <w:r>
+              <w:rPr>
+                <w:b/>
+              </w:rPr>
+              <w:t>D5 qr_verifications</w:t>
+            </w:r>
+            <w:r>
+              <w:t xml:space="preserve">, updates </w:t>
+            </w:r>
+            <w:r>
+              <w:rPr>
+                <w:b/>
+              </w:rPr>
+              <w:t>D4</w:t>
+            </w:r>
+            <w:r>
+              <w:t xml:space="preserve"> (assistance release)</w:t>
+            </w:r>
+          </w:p>
+        </w:tc>
+      </w:tr>
+      <w:tr>
+        <w:tc>
+          <w:tcPr>
+            <w:tcW w:type="dxa" w:w="2160"/>
+          </w:tcPr>
+          <w:p>
+            <w:r/>
+            <w:r>
+              <w:t>6.0</w:t>
+            </w:r>
+          </w:p>
+        </w:tc>
+        <w:tc>
+          <w:tcPr>
+            <w:tcW w:type="dxa" w:w="2160"/>
+          </w:tcPr>
+          <w:p>
+            <w:r/>
+            <w:r>
+              <w:t>Announcements &amp; Needs Survey</w:t>
+            </w:r>
+          </w:p>
+        </w:tc>
+        <w:tc>
+          <w:tcPr>
+            <w:tcW w:type="dxa" w:w="2160"/>
+          </w:tcPr>
+          <w:p>
+            <w:r/>
+            <w:r>
+              <w:t xml:space="preserve">Staff </w:t>
+            </w:r>
+            <w:r>
+              <w:rPr>
+                <w:b/>
+              </w:rPr>
+              <w:t>and</w:t>
+            </w:r>
+            <w:r>
+              <w:t xml:space="preserve"> Public</w:t>
+            </w:r>
+          </w:p>
+        </w:tc>
+        <w:tc>
+          <w:tcPr>
+            <w:tcW w:type="dxa" w:w="2160"/>
+          </w:tcPr>
+          <w:p>
+            <w:r/>
+            <w:r>
+              <w:t xml:space="preserve">reads + writes </w:t>
+            </w:r>
+            <w:r>
+              <w:rPr>
+                <w:b/>
+              </w:rPr>
+              <w:t>D6 announcements · survey_responses</w:t>
+            </w:r>
+            <w:r>
+              <w:t>; sends announcements out to Public</w:t>
+            </w:r>
+          </w:p>
+        </w:tc>
+      </w:tr>
+      <w:tr>
+        <w:tc>
+          <w:tcPr>
+            <w:tcW w:type="dxa" w:w="2160"/>
+          </w:tcPr>
+          <w:p>
+            <w:r/>
+            <w:r>
+              <w:t>7.0</w:t>
+            </w:r>
+          </w:p>
+        </w:tc>
+        <w:tc>
+          <w:tcPr>
+            <w:tcW w:type="dxa" w:w="2160"/>
+          </w:tcPr>
+          <w:p>
+            <w:r/>
+            <w:r>
+              <w:t>Analytics &amp; DILG Reports</w:t>
+            </w:r>
+          </w:p>
+        </w:tc>
+        <w:tc>
+          <w:tcPr>
+            <w:tcW w:type="dxa" w:w="2160"/>
+          </w:tcPr>
+          <w:p>
+            <w:r/>
+            <w:r>
+              <w:t>Staff</w:t>
+            </w:r>
+          </w:p>
+        </w:tc>
+        <w:tc>
+          <w:tcPr>
+            <w:tcW w:type="dxa" w:w="2160"/>
+          </w:tcPr>
+          <w:p>
+            <w:r/>
+            <w:r>
+              <w:t xml:space="preserve">reads </w:t>
+            </w:r>
+            <w:r>
+              <w:rPr>
+                <w:b/>
+              </w:rPr>
+              <w:t>D2, D3, D4, D7</w:t>
+            </w:r>
+            <w:r>
+              <w:t>; sends compliance reports out to DILG</w:t>
+            </w:r>
+          </w:p>
+        </w:tc>
+      </w:tr>
+    </w:tbl>
+    <w:p/>
+    <w:p>
+      <w:r>
+        <w:rPr>
+          <w:b/>
+        </w:rPr>
+        <w:t>The 7 data stores (draw each as an open-ended rectangle):</w:t>
+      </w:r>
+    </w:p>
+    <w:tbl>
+      <w:tblPr>
+        <w:tblStyle w:val="LightGrid-Accent1"/>
+        <w:tblW w:type="auto" w:w="0"/>
+        <w:tblLook w:firstColumn="1" w:firstRow="1" w:lastColumn="0" w:lastRow="0" w:noHBand="0" w:noVBand="1" w:val="04A0"/>
+      </w:tblPr>
+      <w:tblGrid>
+        <w:gridCol w:w="4320"/>
+        <w:gridCol w:w="4320"/>
+      </w:tblGrid>
+      <w:tr>
+        <w:tc>
+          <w:tcPr>
+            <w:tcW w:type="dxa" w:w="4320"/>
+          </w:tcPr>
+          <w:p>
+            <w:r>
+              <w:rPr>
+                <w:b/>
+              </w:rPr>
+            </w:r>
+            <w:r>
+              <w:rPr>
+                <w:b/>
+              </w:rPr>
+              <w:t>ID</w:t>
+            </w:r>
+          </w:p>
+        </w:tc>
+        <w:tc>
+          <w:tcPr>
+            <w:tcW w:type="dxa" w:w="4320"/>
+          </w:tcPr>
+          <w:p>
+            <w:r>
+              <w:rPr>
+                <w:b/>
+              </w:rPr>
+            </w:r>
+            <w:r>
+              <w:rPr>
+                <w:b/>
+              </w:rPr>
+              <w:t>Data store (database tables)</w:t>
+            </w:r>
+          </w:p>
+        </w:tc>
+      </w:tr>
+      <w:tr>
+        <w:tc>
+          <w:tcPr>
+            <w:tcW w:type="dxa" w:w="4320"/>
+          </w:tcPr>
+          <w:p>
+            <w:r/>
+            <w:r>
+              <w:t>D1</w:t>
+            </w:r>
+          </w:p>
+        </w:tc>
+        <w:tc>
+          <w:tcPr>
+            <w:tcW w:type="dxa" w:w="4320"/>
+          </w:tcPr>
+          <w:p>
+            <w:r/>
+            <w:r>
+              <w:t>profiles</w:t>
+            </w:r>
+          </w:p>
+        </w:tc>
+      </w:tr>
+      <w:tr>
+        <w:tc>
+          <w:tcPr>
+            <w:tcW w:type="dxa" w:w="4320"/>
+          </w:tcPr>
+          <w:p>
+            <w:r/>
+            <w:r>
+              <w:t>D2</w:t>
+            </w:r>
+          </w:p>
+        </w:tc>
+        <w:tc>
+          <w:tcPr>
+            <w:tcW w:type="dxa" w:w="4320"/>
+          </w:tcPr>
+          <w:p>
+            <w:r/>
+            <w:r>
+              <w:t>residents · households</w:t>
+            </w:r>
+          </w:p>
+        </w:tc>
+      </w:tr>
+      <w:tr>
+        <w:tc>
+          <w:tcPr>
+            <w:tcW w:type="dxa" w:w="4320"/>
+          </w:tcPr>
+          <w:p>
+            <w:r/>
+            <w:r>
+              <w:t>D3</w:t>
+            </w:r>
+          </w:p>
+        </w:tc>
+        <w:tc>
+          <w:tcPr>
+            <w:tcW w:type="dxa" w:w="4320"/>
+          </w:tcPr>
+          <w:p>
+            <w:r/>
+            <w:r>
+              <w:t>incidents · disaster_risk_zones</w:t>
+            </w:r>
+          </w:p>
+        </w:tc>
+      </w:tr>
+      <w:tr>
+        <w:tc>
+          <w:tcPr>
+            <w:tcW w:type="dxa" w:w="4320"/>
+          </w:tcPr>
+          <w:p>
+            <w:r/>
+            <w:r>
+              <w:t>D4</w:t>
+            </w:r>
+          </w:p>
+        </w:tc>
+        <w:tc>
+          <w:tcPr>
+            <w:tcW w:type="dxa" w:w="4320"/>
+          </w:tcPr>
+          <w:p>
+            <w:r/>
+            <w:r>
+              <w:t>beneficiaries · assistance_programs</w:t>
+            </w:r>
+          </w:p>
+        </w:tc>
+      </w:tr>
+      <w:tr>
+        <w:tc>
+          <w:tcPr>
+            <w:tcW w:type="dxa" w:w="4320"/>
+          </w:tcPr>
+          <w:p>
+            <w:r/>
+            <w:r>
+              <w:t>D5</w:t>
+            </w:r>
+          </w:p>
+        </w:tc>
+        <w:tc>
+          <w:tcPr>
+            <w:tcW w:type="dxa" w:w="4320"/>
+          </w:tcPr>
+          <w:p>
+            <w:r/>
+            <w:r>
+              <w:t>qr_verifications</w:t>
+            </w:r>
+          </w:p>
+        </w:tc>
+      </w:tr>
+      <w:tr>
+        <w:tc>
+          <w:tcPr>
+            <w:tcW w:type="dxa" w:w="4320"/>
+          </w:tcPr>
+          <w:p>
+            <w:r/>
+            <w:r>
+              <w:t>D6</w:t>
+            </w:r>
+          </w:p>
+        </w:tc>
+        <w:tc>
+          <w:tcPr>
+            <w:tcW w:type="dxa" w:w="4320"/>
+          </w:tcPr>
+          <w:p>
+            <w:r/>
+            <w:r>
+              <w:t>announcements · survey_responses</w:t>
+            </w:r>
+          </w:p>
+        </w:tc>
+      </w:tr>
+      <w:tr>
+        <w:tc>
+          <w:tcPr>
+            <w:tcW w:type="dxa" w:w="4320"/>
+          </w:tcPr>
+          <w:p>
+            <w:r/>
+            <w:r>
+              <w:t>D7</w:t>
+            </w:r>
+          </w:p>
+        </w:tc>
+        <w:tc>
+          <w:tcPr>
+            <w:tcW w:type="dxa" w:w="4320"/>
+          </w:tcPr>
+          <w:p>
+            <w:r/>
+            <w:r>
+              <w:t>population_history · audit_logs</w:t>
+            </w:r>
+          </w:p>
+        </w:tc>
+      </w:tr>
+    </w:tbl>
+    <w:p/>
+    <w:p>
+      <w:r>
+        <w:rPr>
+          <w:b/>
+        </w:rPr>
+        <w:t>How to read/draw the arrows (the key to understanding it):</w:t>
       </w:r>
     </w:p>
     <w:p>
@@ -2503,40 +3308,25 @@
         <w:pStyle w:val="ListBullet"/>
       </w:pPr>
       <w:r>
-        <w:t xml:space="preserve">System → Resident / Public: </w:t>
+        <w:t xml:space="preserve">Arrow </w:t>
+      </w:r>
+      <w:r>
+        <w:rPr>
+          <w:b/>
+        </w:rPr>
+        <w:t>from an entity → a process</w:t>
+      </w:r>
+      <w:r>
+        <w:t xml:space="preserve"> = that person is </w:t>
       </w:r>
       <w:r>
         <w:rPr>
           <w:i/>
         </w:rPr>
-        <w:t>public announcements</w:t>
-      </w:r>
-    </w:p>
-    <w:p>
-      <w:pPr>
-        <w:pStyle w:val="Heading3"/>
-      </w:pPr>
-      <w:r>
-        <w:t>Level 1 Diagram</w:t>
-      </w:r>
-    </w:p>
-    <w:p>
-      <w:r>
-        <w:rPr>
-          <w:b/>
-        </w:rPr>
-        <w:t>External entities:</w:t>
-      </w:r>
-      <w:r>
-        <w:t xml:space="preserve"> Barangay Staff · Resident/Public · DILG/Government</w:t>
-      </w:r>
-    </w:p>
-    <w:p>
-      <w:r>
-        <w:rPr>
-          <w:b/>
-        </w:rPr>
-        <w:t>Processes (numbered circles):</w:t>
+        <w:t>sending data in</w:t>
+      </w:r>
+      <w:r>
+        <w:t xml:space="preserve"> (e.g., Staff → 2.0 = staff enters a resident).</w:t>
       </w:r>
     </w:p>
     <w:p>
@@ -2544,7 +3334,25 @@
         <w:pStyle w:val="ListBullet"/>
       </w:pPr>
       <w:r>
-        <w:t>1.0 Authenticate &amp; Authorize</w:t>
+        <w:t xml:space="preserve">Arrow </w:t>
+      </w:r>
+      <w:r>
+        <w:rPr>
+          <w:b/>
+        </w:rPr>
+        <w:t>from a process → a data store</w:t>
+      </w:r>
+      <w:r>
+        <w:t xml:space="preserve"> = the system is </w:t>
+      </w:r>
+      <w:r>
+        <w:rPr>
+          <w:i/>
+        </w:rPr>
+        <w:t>saving</w:t>
+      </w:r>
+      <w:r>
+        <w:t xml:space="preserve"> data (e.g., 2.0 → D2 = save the resident).</w:t>
       </w:r>
     </w:p>
     <w:p>
@@ -2552,7 +3360,25 @@
         <w:pStyle w:val="ListBullet"/>
       </w:pPr>
       <w:r>
-        <w:t>2.0 Manage Residents &amp; Households / GIS</w:t>
+        <w:t xml:space="preserve">Arrow </w:t>
+      </w:r>
+      <w:r>
+        <w:rPr>
+          <w:b/>
+        </w:rPr>
+        <w:t>from a data store → a process</w:t>
+      </w:r>
+      <w:r>
+        <w:t xml:space="preserve"> = the system is </w:t>
+      </w:r>
+      <w:r>
+        <w:rPr>
+          <w:i/>
+        </w:rPr>
+        <w:t>reading</w:t>
+      </w:r>
+      <w:r>
+        <w:t xml:space="preserve"> saved data (e.g., D2 → 7.0 = analytics reads residents).</w:t>
       </w:r>
     </w:p>
     <w:p>
@@ -2560,7 +3386,142 @@
         <w:pStyle w:val="ListBullet"/>
       </w:pPr>
       <w:r>
-        <w:t>3.0 Log Incidents &amp; Map Crime</w:t>
+        <w:t xml:space="preserve">Arrow </w:t>
+      </w:r>
+      <w:r>
+        <w:rPr>
+          <w:b/>
+        </w:rPr>
+        <w:t>from a process → an entity</w:t>
+      </w:r>
+      <w:r>
+        <w:t xml:space="preserve"> = the system is </w:t>
+      </w:r>
+      <w:r>
+        <w:rPr>
+          <w:i/>
+        </w:rPr>
+        <w:t>sending output out</w:t>
+      </w:r>
+      <w:r>
+        <w:t xml:space="preserve"> (e.g., 7.0 → DILG = a report).</w:t>
+      </w:r>
+    </w:p>
+    <w:p>
+      <w:r>
+        <w:t xml:space="preserve">So for each process you typically draw: </w:t>
+      </w:r>
+      <w:r>
+        <w:rPr>
+          <w:b/>
+        </w:rPr>
+        <w:t>entity → process</w:t>
+      </w:r>
+      <w:r>
+        <w:t xml:space="preserve">, </w:t>
+      </w:r>
+      <w:r>
+        <w:rPr>
+          <w:b/>
+        </w:rPr>
+        <w:t>process ↔ its data store(s)</w:t>
+      </w:r>
+      <w:r>
+        <w:t>, and</w:t>
+      </w:r>
+    </w:p>
+    <w:p>
+      <w:r>
+        <w:t xml:space="preserve">(for 6.0 and 7.0) </w:t>
+      </w:r>
+      <w:r>
+        <w:rPr>
+          <w:b/>
+        </w:rPr>
+        <w:t>process → an external entity</w:t>
+      </w:r>
+      <w:r>
+        <w:t xml:space="preserve"> for the output.</w:t>
+      </w:r>
+    </w:p>
+    <w:p>
+      <w:r>
+        <w:rPr>
+          <w:color w:val="CCCCCC"/>
+        </w:rPr>
+        <w:t>__________________________________________________</w:t>
+      </w:r>
+    </w:p>
+    <w:p>
+      <w:pPr>
+        <w:pStyle w:val="Heading2"/>
+      </w:pPr>
+      <w:r>
+        <w:t>4) USE CASE DIAGRAM</w:t>
+      </w:r>
+    </w:p>
+    <w:p>
+      <w:r>
+        <w:t xml:space="preserve">Three actors, one system boundary, use cases grouped into four packages in a </w:t>
+      </w:r>
+      <w:r>
+        <w:rPr>
+          <w:b/>
+        </w:rPr>
+        <w:t>2×2 grid</w:t>
+      </w:r>
+      <w:r>
+        <w:t xml:space="preserve"> (keeps it</w:t>
+      </w:r>
+    </w:p>
+    <w:p>
+      <w:r>
+        <w:t>balanced — not a tall ribbon). Actors on the sides; ovals = use cases; lines = associations.</w:t>
+      </w:r>
+    </w:p>
+    <w:p>
+      <w:r>
+        <w:rPr>
+          <w:rFonts w:ascii="Consolas" w:hAnsi="Consolas"/>
+          <w:sz w:val="17"/>
+        </w:rPr>
+        <w:t xml:space="preserve"> [Barangay Secretary]        ┌──────────────── PROTECT System ────────────────┐</w:t>
+        <w:br/>
+        <w:t xml:space="preserve">  (actor, left)              │  ┌── Resident Services ──┐ ┌── Community &amp; Needs ──┐</w:t>
+        <w:br/>
+        <w:t xml:space="preserve">                             │  │ ( Manage Profiles )   │ │ ( Manage Announcements)│</w:t>
+        <w:br/>
+        <w:t xml:space="preserve"> [Barangay Tanod]            │  │ ( QR / Issue Docs )   │ │ ( Submit Needs ) *─────┼─▶ [Resident /</w:t>
+        <w:br/>
+        <w:t xml:space="preserve">  (actor, left)              │  │ ( Track Beneficiaries)│ │ ( View Announcements)* │    Public]</w:t>
+        <w:br/>
+        <w:t xml:space="preserve">                             │  └───────────────────────┘ └───────────────────────┘   (actor, right)</w:t>
+        <w:br/>
+        <w:t xml:space="preserve">                             │  ┌── Analytics, Maps &amp; Prediction ┐ ┌── Safety, Reporting &amp; Admin ┐</w:t>
+        <w:br/>
+        <w:t xml:space="preserve">                             │  │ ( View Dashboard )             │ │ ( Log Incident )            │</w:t>
+        <w:br/>
+        <w:t xml:space="preserve">                             │  │ ( View Analytics )             │ │ ( Update Incident Status )  │</w:t>
+        <w:br/>
+        <w:t xml:space="preserve">                             │  │ ( View GIS &amp; Disaster Maps )   │ │ ( Generate DILG Reports )   │</w:t>
+        <w:br/>
+        <w:t xml:space="preserve">                             │  │ ( View Crime Hotspot Map )     │ │ ( Manage Users &amp; Roles )    │</w:t>
+        <w:br/>
+        <w:t xml:space="preserve">                             │  │ ( View Predictive Growth )     │ │ ( Review Audit Log &amp; Backup)│</w:t>
+        <w:br/>
+        <w:t xml:space="preserve">                             │  └────────────────────────────────┘ │ ( Authenticate / Login )    │</w:t>
+        <w:br/>
+        <w:t xml:space="preserve">                             │                                      └─────────────────────────────┘</w:t>
+        <w:br/>
+        <w:t xml:space="preserve">                             └──────────────────────────────────────────────────────────────────┘</w:t>
+      </w:r>
+    </w:p>
+    <w:p>
+      <w:r>
+        <w:rPr>
+          <w:b/>
+        </w:rPr>
+        <w:t>Associations (who connects to which use case):</w:t>
       </w:r>
     </w:p>
     <w:p>
@@ -2568,7 +3529,22 @@
         <w:pStyle w:val="ListBullet"/>
       </w:pPr>
       <w:r>
-        <w:t>4.0 Manage Beneficiaries &amp; Assistance</w:t>
+        <w:rPr>
+          <w:b/>
+        </w:rPr>
+        <w:t>Barangay Secretary</w:t>
+      </w:r>
+      <w:r>
+        <w:t xml:space="preserve"> → every use case </w:t>
+      </w:r>
+      <w:r>
+        <w:rPr>
+          <w:b/>
+        </w:rPr>
+        <w:t>except</w:t>
+      </w:r>
+      <w:r>
+        <w:t xml:space="preserve"> the two resident-only ones.</w:t>
       </w:r>
     </w:p>
     <w:p>
@@ -2576,7 +3552,18 @@
         <w:pStyle w:val="ListBullet"/>
       </w:pPr>
       <w:r>
-        <w:t>5.0 QR Verification &amp; Documents</w:t>
+        <w:rPr>
+          <w:b/>
+        </w:rPr>
+        <w:t>Barangay Tanod</w:t>
+      </w:r>
+      <w:r>
+        <w:t xml:space="preserve"> → only: View Community Dashboard, View Crime Hotspot Map, Log Incident,</w:t>
+      </w:r>
+    </w:p>
+    <w:p>
+      <w:r>
+        <w:t xml:space="preserve">  Update Incident Status, Authenticate/Login.</w:t>
       </w:r>
     </w:p>
     <w:p>
@@ -2584,7 +3571,55 @@
         <w:pStyle w:val="ListBullet"/>
       </w:pPr>
       <w:r>
-        <w:t>6.0 Announcements &amp; Needs Survey</w:t>
+        <w:rPr>
+          <w:b/>
+        </w:rPr>
+        <w:t>Resident / Public</w:t>
+      </w:r>
+      <w:r>
+        <w:t xml:space="preserve"> → only the two marked </w:t>
+      </w:r>
+      <w:r>
+        <w:rPr>
+          <w:rFonts w:ascii="Consolas" w:hAnsi="Consolas"/>
+          <w:sz w:val="20"/>
+        </w:rPr>
+        <w:t>*</w:t>
+      </w:r>
+      <w:r>
+        <w:t>: Submit Needs Assessment, View Public Announcements.</w:t>
+      </w:r>
+    </w:p>
+    <w:p>
+      <w:r>
+        <w:rPr>
+          <w:b/>
+        </w:rPr>
+        <w:t>Colors (match the legend):</w:t>
+      </w:r>
+      <w:r>
+        <w:t xml:space="preserve"> Resident=green · Analytics/Maps=purple · Incident=tan ·</w:t>
+      </w:r>
+    </w:p>
+    <w:p>
+      <w:r>
+        <w:t>Reporting/Prediction=blue · Needs/Community=pink · Administration/Security=lavender.</w:t>
+      </w:r>
+    </w:p>
+    <w:p>
+      <w:r>
+        <w:rPr>
+          <w:color w:val="CCCCCC"/>
+        </w:rPr>
+        <w:t>__________________________________________________</w:t>
+      </w:r>
+    </w:p>
+    <w:p>
+      <w:pPr>
+        <w:pStyle w:val="Heading2"/>
+      </w:pPr>
+      <w:r>
+        <w:t>Lucidchart tips</w:t>
       </w:r>
     </w:p>
     <w:p>
@@ -2592,15 +3627,16 @@
         <w:pStyle w:val="ListBullet"/>
       </w:pPr>
       <w:r>
-        <w:t>7.0 Analytics &amp; DILG Reports</w:t>
-      </w:r>
-    </w:p>
-    <w:p>
+        <w:t xml:space="preserve">ERD: use the built-in </w:t>
+      </w:r>
       <w:r>
         <w:rPr>
           <w:b/>
         </w:rPr>
-        <w:t>Data stores (open-ended rectangles):</w:t>
+        <w:t>ERD shape library</w:t>
+      </w:r>
+      <w:r>
+        <w:t xml:space="preserve"> (Database category) so PK/FK columns render cleanly.</w:t>
       </w:r>
     </w:p>
     <w:p>
@@ -2608,7 +3644,7 @@
         <w:pStyle w:val="ListBullet"/>
       </w:pPr>
       <w:r>
-        <w:t>D1 profiles</w:t>
+        <w:t>Keep crow's-foot cardinality consistent (one = bar, many = crow's foot).</w:t>
       </w:r>
     </w:p>
     <w:p>
@@ -2616,7 +3652,12 @@
         <w:pStyle w:val="ListBullet"/>
       </w:pPr>
       <w:r>
-        <w:t>D2 residents · households</w:t>
+        <w:t>For the SFC, lay the main flow top-to-bottom and put each sub-flowchart on its own row connected</w:t>
+      </w:r>
+    </w:p>
+    <w:p>
+      <w:r>
+        <w:t xml:space="preserve">  by the lettered circles (A–K, return at R) — matches the paper's Figures 4–10.</w:t>
       </w:r>
     </w:p>
     <w:p>
@@ -2624,188 +3665,11 @@
         <w:pStyle w:val="ListBullet"/>
       </w:pPr>
       <w:r>
-        <w:t>D3 incidents · disaster_risk_zones</w:t>
-      </w:r>
-    </w:p>
-    <w:p>
-      <w:pPr>
-        <w:pStyle w:val="ListBullet"/>
-      </w:pPr>
-      <w:r>
-        <w:t>D4 beneficiaries · assistance_programs</w:t>
-      </w:r>
-    </w:p>
-    <w:p>
-      <w:pPr>
-        <w:pStyle w:val="ListBullet"/>
-      </w:pPr>
-      <w:r>
-        <w:t>D5 qr_verifications</w:t>
-      </w:r>
-    </w:p>
-    <w:p>
-      <w:pPr>
-        <w:pStyle w:val="ListBullet"/>
-      </w:pPr>
-      <w:r>
-        <w:t>D6 announcements · survey_responses</w:t>
-      </w:r>
-    </w:p>
-    <w:p>
-      <w:pPr>
-        <w:pStyle w:val="ListBullet"/>
-      </w:pPr>
-      <w:r>
-        <w:t>D7 population_history · audit_logs</w:t>
-      </w:r>
-    </w:p>
-    <w:p>
-      <w:r>
-        <w:rPr>
-          <w:b/>
-        </w:rPr>
-        <w:t>Flows:</w:t>
-      </w:r>
-    </w:p>
-    <w:p>
-      <w:pPr>
-        <w:pStyle w:val="ListBullet"/>
-      </w:pPr>
-      <w:r>
-        <w:t>Staff → 1.0 → D1</w:t>
-      </w:r>
-    </w:p>
-    <w:p>
-      <w:pPr>
-        <w:pStyle w:val="ListBullet"/>
-      </w:pPr>
-      <w:r>
-        <w:t>Staff ↔ 2.0 ↔ D2</w:t>
-      </w:r>
-    </w:p>
-    <w:p>
-      <w:pPr>
-        <w:pStyle w:val="ListBullet"/>
-      </w:pPr>
-      <w:r>
-        <w:t>Staff ↔ 3.0 ↔ D3</w:t>
-      </w:r>
-    </w:p>
-    <w:p>
-      <w:pPr>
-        <w:pStyle w:val="ListBullet"/>
-      </w:pPr>
-      <w:r>
-        <w:t>Staff ↔ 4.0 ↔ D4</w:t>
-      </w:r>
-    </w:p>
-    <w:p>
-      <w:pPr>
-        <w:pStyle w:val="ListBullet"/>
-      </w:pPr>
-      <w:r>
-        <w:t xml:space="preserve">Staff → 5.0; D2 → 5.0; 5.0 → D5; 5.0 → D4 </w:t>
-      </w:r>
-      <w:r>
-        <w:rPr>
-          <w:i/>
-        </w:rPr>
-        <w:t>(assistance release)</w:t>
-      </w:r>
-    </w:p>
-    <w:p>
-      <w:pPr>
-        <w:pStyle w:val="ListBullet"/>
-      </w:pPr>
-      <w:r>
-        <w:t xml:space="preserve">Staff → 6.0; Public → 6.0; 6.0 ↔ D6; D6 → Public </w:t>
-      </w:r>
-      <w:r>
-        <w:rPr>
-          <w:i/>
-        </w:rPr>
-        <w:t>(public announcements)</w:t>
-      </w:r>
-    </w:p>
-    <w:p>
-      <w:pPr>
-        <w:pStyle w:val="ListBullet"/>
-      </w:pPr>
-      <w:r>
-        <w:t xml:space="preserve">Staff → 7.0; D2, D3, D4, D7 → 7.0; 7.0 → DILG </w:t>
-      </w:r>
-      <w:r>
-        <w:rPr>
-          <w:i/>
-        </w:rPr>
-        <w:t>(compliance reports)</w:t>
-      </w:r>
-    </w:p>
-    <w:p>
-      <w:r>
-        <w:rPr>
-          <w:color w:val="CCCCCC"/>
-        </w:rPr>
-        <w:t>__________________________________________________</w:t>
-      </w:r>
-    </w:p>
-    <w:p>
-      <w:pPr>
-        <w:pStyle w:val="Heading2"/>
-      </w:pPr>
-      <w:r>
-        <w:t>Lucidchart tips</w:t>
-      </w:r>
-    </w:p>
-    <w:p>
-      <w:pPr>
-        <w:pStyle w:val="ListBullet"/>
-      </w:pPr>
-      <w:r>
-        <w:t xml:space="preserve">ERD: use the built-in </w:t>
-      </w:r>
-      <w:r>
-        <w:rPr>
-          <w:b/>
-        </w:rPr>
-        <w:t>ERD shape library</w:t>
-      </w:r>
-      <w:r>
-        <w:t xml:space="preserve"> (Database category) so PK/FK columns render cleanly.</w:t>
-      </w:r>
-    </w:p>
-    <w:p>
-      <w:pPr>
-        <w:pStyle w:val="ListBullet"/>
-      </w:pPr>
-      <w:r>
-        <w:t>Keep crow's-foot cardinality consistent (one = bar, many = crow's foot).</w:t>
-      </w:r>
-    </w:p>
-    <w:p>
-      <w:pPr>
-        <w:pStyle w:val="ListBullet"/>
-      </w:pPr>
-      <w:r>
-        <w:t>For the SFC, lay the main flow top-to-bottom and put each sub-flowchart on its own row connected</w:t>
-      </w:r>
-    </w:p>
-    <w:p>
-      <w:r>
-        <w:t xml:space="preserve">  by the lettered circles (A–K, return at R) — matches the paper's Figures 4–10.</w:t>
-      </w:r>
-    </w:p>
-    <w:p>
-      <w:pPr>
-        <w:pStyle w:val="ListBullet"/>
-      </w:pPr>
-      <w:r>
         <w:t xml:space="preserve">For the DFD, number processes </w:t>
       </w:r>
       <w:r>
         <w:rPr>
           <w:rFonts w:ascii="Consolas" w:hAnsi="Consolas"/>
-          <w:color w:val="B03060"/>
           <w:sz w:val="20"/>
         </w:rPr>
         <w:t>1.0</w:t>
@@ -2816,7 +3680,6 @@
       <w:r>
         <w:rPr>
           <w:rFonts w:ascii="Consolas" w:hAnsi="Consolas"/>
-          <w:color w:val="B03060"/>
           <w:sz w:val="20"/>
         </w:rPr>
         <w:t>7.0</w:t>
@@ -2827,7 +3690,6 @@
       <w:r>
         <w:rPr>
           <w:rFonts w:ascii="Consolas" w:hAnsi="Consolas"/>
-          <w:color w:val="B03060"/>
           <w:sz w:val="20"/>
         </w:rPr>
         <w:t>D1</w:t>
@@ -2838,7 +3700,6 @@
       <w:r>
         <w:rPr>
           <w:rFonts w:ascii="Consolas" w:hAnsi="Consolas"/>
-          <w:color w:val="B03060"/>
           <w:sz w:val="20"/>
         </w:rPr>
         <w:t>D7</w:t>

</xml_diff>